<commit_message>
docs: refresh AIDD Foundational Guidance (Word save / TOC update)
Co-Authored-By: Claude Opus 4.8 <noreply@anthropic.com>
</commit_message>
<xml_diff>
--- a/AIDD_Foundational_Guidance.docx
+++ b/AIDD_Foundational_Guidance.docx
@@ -20,7 +20,7 @@
           <w:sz w:val="56"/>
           <w:szCs w:val="56"/>
         </w:rPr>
-        <w:t>AI-Driven Lifecycle</w:t>
+        <w:t>AI-Driven Development</w:t>
       </w:r>
     </w:p>
     <w:p>
@@ -2971,7 +2971,7 @@
         <w:spacing w:after="120"/>
       </w:pPr>
       <w:r>
-        <w:t>AI-Driven Lifecycle (AIDLC) refers to the end-to-end process by which AI systems interpret intent, reason through problems, apply governance, and produce reliable outputs — spanning from a developer's goal all the way through to execution on a runtime environment.</w:t>
+        <w:t>AI-Driven Development (AIDD) is the practice of building software systems where AI does much of the interpreting, reasoning, and producing — under human direction and governance.</w:t>
       </w:r>
     </w:p>
     <w:p>
@@ -3003,7 +3003,7 @@
         <w:spacing w:after="120"/>
       </w:pPr>
       <w:r>
-        <w:t>This document establishes the foundational guidance for how Dojo360 approaches AIDLC — defining the layers, their contracts, and how they interact. It is tool-agnostic by design, covering Claude, Codex, and Copilot where relevant, so that teams can make informed decisions regardless of which tool they are using today or will use tomorrow.</w:t>
+        <w:t>This document establishes the foundational guidance for how Dojo360 approaches AI-Driven Development — defining the layers that make up an AI-driven system, their contracts, and how context, cost, and governance flow across them. It is tool-agnostic by design, covering Claude, Codex, and Copilot where relevant, so that teams can make informed decisions regardless of which tool they are using today or will use tomorrow.</w:t>
       </w:r>
     </w:p>
     <w:p>
@@ -3157,7 +3157,7 @@
         <w:spacing w:after="120"/>
       </w:pPr>
       <w:r>
-        <w:t>The diagram below represents the typical layers involved in an end-to-end AI-Driven Lifecycle (AIDLC). Each layer has a distinct responsibility and plays a specific role in how work is interpreted, governed, and executed.</w:t>
+        <w:t>The diagram below represents the typical layers involved in AI-Driven Development (AIDD). Each layer has a distinct responsibility and plays a specific role in how work is interpreted, governed, and executed.</w:t>
       </w:r>
     </w:p>
     <w:p>
@@ -8734,7 +8734,7 @@
         <w:t xml:space="preserve">self-educating, </w:t>
       </w:r>
       <w:r>
-        <w:t>self-documenting and integrated with AIDLC so an agentic system can maintain, document, and update them</w:t>
+        <w:t>self-documenting and integrated with the AI-Driven Development workflow so an agentic system can maintain, document, and update them</w:t>
       </w:r>
     </w:p>
     <w:p>

</xml_diff>